<commit_message>
Update FIAKeyTerms data for 2026-09-14 release
</commit_message>
<xml_diff>
--- a/eng/docx/001.content.docx
+++ b/eng/docx/001.content.docx
@@ -1578,7 +1578,7 @@
         <w:rPr>
           <w:lang w:val="en_US" w:bidi="en_US"/>
         </w:rPr>
-        <w:t xml:space="preserve"> (562556 KB)</w:t>
+        <w:t xml:space="preserve"> (552525 KB)</w:t>
       </w:r>
       <w:r>
         <w:rPr>
@@ -2235,7 +2235,7 @@
         <w:rPr>
           <w:lang w:val="en_US" w:bidi="en_US"/>
         </w:rPr>
-        <w:t xml:space="preserve"> (1482524 KB)</w:t>
+        <w:t xml:space="preserve"> (1463037 KB)</w:t>
       </w:r>
       <w:r>
         <w:rPr>
@@ -2948,7 +2948,7 @@
         <w:rPr>
           <w:lang w:val="en_US" w:bidi="en_US"/>
         </w:rPr>
-        <w:t xml:space="preserve"> (1763060 KB)</w:t>
+        <w:t xml:space="preserve"> (1748709 KB)</w:t>
       </w:r>
       <w:r>
         <w:rPr>
@@ -3715,7 +3715,7 @@
         <w:rPr>
           <w:lang w:val="en_US" w:bidi="en_US"/>
         </w:rPr>
-        <w:t xml:space="preserve"> (1407164 KB)</w:t>
+        <w:t xml:space="preserve"> (1398861 KB)</w:t>
       </w:r>
       <w:r>
         <w:rPr>
@@ -4147,7 +4147,7 @@
         <w:rPr>
           <w:lang w:val="en_US" w:bidi="en_US"/>
         </w:rPr>
-        <w:t xml:space="preserve"> (561260 KB)</w:t>
+        <w:t xml:space="preserve"> (561261 KB)</w:t>
       </w:r>
       <w:r>
         <w:rPr>

</xml_diff>

<commit_message>
Update FIAKeyTerms data for 2026-10-05 release
</commit_message>
<xml_diff>
--- a/eng/docx/001.content.docx
+++ b/eng/docx/001.content.docx
@@ -340,7 +340,7 @@
         <w:rPr>
           <w:lang w:val="en_US" w:bidi="en_US"/>
         </w:rPr>
-        <w:t xml:space="preserve"> (391268 KB)</w:t>
+        <w:t xml:space="preserve"> (382 KB)</w:t>
       </w:r>
       <w:r>
         <w:rPr>
@@ -675,7 +675,7 @@
         <w:rPr>
           <w:lang w:val="en_US" w:bidi="en_US"/>
         </w:rPr>
-        <w:t xml:space="preserve"> (2502188 KB)</w:t>
+        <w:t xml:space="preserve"> (2.4 MB)</w:t>
       </w:r>
       <w:r>
         <w:rPr>
@@ -824,7 +824,7 @@
         <w:rPr>
           <w:lang w:val="en_US" w:bidi="en_US"/>
         </w:rPr>
-        <w:t xml:space="preserve"> (223100 KB)</w:t>
+        <w:t xml:space="preserve"> (218 KB)</w:t>
       </w:r>
       <w:r>
         <w:rPr>
@@ -1058,7 +1058,7 @@
         <w:rPr>
           <w:lang w:val="en_US" w:bidi="en_US"/>
         </w:rPr>
-        <w:t xml:space="preserve"> (1129196 KB)</w:t>
+        <w:t xml:space="preserve"> (1.1 MB)</w:t>
       </w:r>
       <w:r>
         <w:rPr>
@@ -1209,7 +1209,7 @@
         <w:rPr>
           <w:lang w:val="en_US" w:bidi="en_US"/>
         </w:rPr>
-        <w:t xml:space="preserve"> (666428 KB)</w:t>
+        <w:t xml:space="preserve"> (651 KB)</w:t>
       </w:r>
       <w:r>
         <w:rPr>
@@ -1434,7 +1434,7 @@
         <w:rPr>
           <w:lang w:val="en_US" w:bidi="en_US"/>
         </w:rPr>
-        <w:t xml:space="preserve"> (552525 KB)</w:t>
+        <w:t xml:space="preserve"> (540 KB)</w:t>
       </w:r>
       <w:r>
         <w:rPr>
@@ -1643,7 +1643,7 @@
         <w:rPr>
           <w:lang w:val="en_US" w:bidi="en_US"/>
         </w:rPr>
-        <w:t xml:space="preserve"> (582548 KB)</w:t>
+        <w:t xml:space="preserve"> (569 KB)</w:t>
       </w:r>
       <w:r>
         <w:rPr>
@@ -2013,7 +2013,7 @@
         <w:rPr>
           <w:lang w:val="en_US" w:bidi="en_US"/>
         </w:rPr>
-        <w:t xml:space="preserve"> (1463037 KB)</w:t>
+        <w:t xml:space="preserve"> (1.4 MB)</w:t>
       </w:r>
       <w:r>
         <w:rPr>
@@ -2149,7 +2149,7 @@
         <w:rPr>
           <w:lang w:val="en_US" w:bidi="en_US"/>
         </w:rPr>
-        <w:t xml:space="preserve"> (643868 KB)</w:t>
+        <w:t xml:space="preserve"> (629 KB)</w:t>
       </w:r>
       <w:r>
         <w:rPr>
@@ -2606,7 +2606,7 @@
         <w:rPr>
           <w:lang w:val="en_US" w:bidi="en_US"/>
         </w:rPr>
-        <w:t xml:space="preserve"> (1748709 KB)</w:t>
+        <w:t xml:space="preserve"> (1.7 MB)</w:t>
       </w:r>
       <w:r>
         <w:rPr>
@@ -2743,7 +2743,7 @@
         <w:rPr>
           <w:lang w:val="en_US" w:bidi="en_US"/>
         </w:rPr>
-        <w:t xml:space="preserve"> (209564 KB)</w:t>
+        <w:t xml:space="preserve"> (205 KB)</w:t>
       </w:r>
       <w:r>
         <w:rPr>
@@ -2964,7 +2964,7 @@
         <w:rPr>
           <w:lang w:val="en_US" w:bidi="en_US"/>
         </w:rPr>
-        <w:t xml:space="preserve"> (494780 KB)</w:t>
+        <w:t xml:space="preserve"> (483 KB)</w:t>
       </w:r>
       <w:r>
         <w:rPr>
@@ -3301,7 +3301,7 @@
         <w:rPr>
           <w:lang w:val="en_US" w:bidi="en_US"/>
         </w:rPr>
-        <w:t xml:space="preserve"> (1398861 KB)</w:t>
+        <w:t xml:space="preserve"> (1.3 MB)</w:t>
       </w:r>
       <w:r>
         <w:rPr>
@@ -3330,83 +3330,291 @@
         <w:rPr>
           <w:lang w:val="en_US" w:bidi="en_US"/>
         </w:rPr>
-        <w:t>atonement</w:t>
-      </w:r>
-      <w:r>
-        <w:rPr>
-          <w:lang w:val="en_US" w:bidi="en_US"/>
-        </w:rPr>
-      </w:r>
-    </w:p>
-    <w:p>
-      <w:pPr/>
-      <w:r>
-        <w:rPr>
-          <w:lang w:val="en_US" w:bidi="en_US"/>
-        </w:rPr>
+        <w:t>ark of the covenant</w:t>
+      </w:r>
+      <w:r>
+        <w:rPr>
+          <w:lang w:val="en_US" w:bidi="en_US"/>
+        </w:rPr>
+      </w:r>
+    </w:p>
+    <w:p>
+      <w:pPr/>
+      <w:r>
+        <w:rPr>
+          <w:lang w:val="en_US" w:bidi="en_US"/>
+        </w:rPr>
+      </w:r>
+      <w:r>
+        <w:rPr>
+          <w:lang w:val="en_US" w:bidi="en_US"/>
+        </w:rPr>
+        <w:t xml:space="preserve">The </w:t>
       </w:r>
       <w:r>
         <w:rPr>
           <w:b/>
           <w:lang w:val="en_US" w:bidi="en_US"/>
         </w:rPr>
-        <w:t>t258: atone/atonement</w:t>
-      </w:r>
-    </w:p>
-    <w:p>
-      <w:pPr/>
-      <w:r>
-        <w:rPr>
-          <w:lang w:val="en_US" w:bidi="en_US"/>
-        </w:rPr>
-      </w:r>
-      <w:r>
-        <w:rPr>
-          <w:lang w:val="en_US" w:bidi="en_US"/>
-        </w:rPr>
-        <w:t>During the time of the Old Testament, when someone did something bad to somebody else, people believed that three things would happen. First, people believed that the relationship between the two people would be broken. Second, people believed that the bad thing that the person did would make that person and their surroundings spiritually dirty. Third, people believed that God would notice the spiritual dirt and punish the person who did the bad thing.</w:t>
-      </w:r>
-    </w:p>
-    <w:p>
-      <w:pPr/>
-      <w:r>
-        <w:rPr>
-          <w:lang w:val="en_US" w:bidi="en_US"/>
-        </w:rPr>
-      </w:r>
-      <w:r>
-        <w:rPr>
-          <w:lang w:val="en_US" w:bidi="en_US"/>
-        </w:rPr>
-        <w:t>Atonement fixed all three of these problems. Atonement would restore the broken relationship between the two people. Atonement would cleanse the person and their surroundings from the bad thing that made them spiritually dirty. Because the person was cleansed from the bad thing he or she did, God would not punish the person.</w:t>
-      </w:r>
-    </w:p>
-    <w:p>
-      <w:pPr/>
-      <w:r>
-        <w:rPr>
-          <w:lang w:val="en_US" w:bidi="en_US"/>
-        </w:rPr>
-      </w:r>
-      <w:r>
-        <w:rPr>
-          <w:lang w:val="en_US" w:bidi="en_US"/>
-        </w:rPr>
-        <w:t>If people did something bad to another human, they would usually give a gift to the person they had done something bad to in order to atone for what they did. If people did something bad to Yahweh, they would give Yahweh a gift of an animal sacrifice to atone for what they did. Yahweh said that the blood of the animal would cleanse the person who had done the bad thing. Being spiritually clean would restore that person's good relationship with Yahweh, and so Yahweh would not punish the person for the bad thing that he or she did.</w:t>
-      </w:r>
-    </w:p>
-    <w:p>
-      <w:pPr/>
-      <w:r>
-        <w:rPr>
-          <w:lang w:val="en_US" w:bidi="en_US"/>
-        </w:rPr>
-      </w:r>
-      <w:r>
-        <w:rPr>
-          <w:lang w:val="en_US" w:bidi="en_US"/>
-        </w:rPr>
-        <w:t>In the New Testament, Jesus came to atone for all the bad things that everyone has done. Because Jesus never did anything bad, Jesus did not need to atone for anything. But Jesus chose to die so that Jesus' blood could atone for the bad things that everyone else did. Now, if people choose to become Jesus's followers, Jesus's blood atones for all the bad things those people did against Yahweh. That means that Jesus's blood cleanses people from the spiritual dirt that covers them and makes people clean again. Being spiritually clean restores people's good relationship with Yahweh. Because Jesus's followers are now spiritually clean and have a good relationship with Yahweh, Yahweh will not send them to eternal punishment for what they have done.</w:t>
+        <w:t>ark of the covenant</w:t>
+      </w:r>
+      <w:r>
+        <w:rPr>
+          <w:lang w:val="en_US" w:bidi="en_US"/>
+        </w:rPr>
+        <w:t xml:space="preserve"> was a rectangular chest that skilled </w:t>
+      </w:r>
+      <w:r>
+        <w:rPr>
+          <w:lang w:val="en_US" w:bidi="en_US"/>
+        </w:rPr>
+        <w:t>Israelite</w:t>
+      </w:r>
+      <w:r>
+        <w:rPr>
+          <w:lang w:val="en_US" w:bidi="en_US"/>
+        </w:rPr>
+        <w:t xml:space="preserve"> craftsmen made from acacia wood and covered with gold inside and out. The ark of the covenant was not a boat, like Noah's ark. The ark of the covenant was about 115 centimeters long, 69 centimeters wide, and 69 centimeters high. The craftsmen attached four gold rings at the bottom corners of the ark and inserted poles so the </w:t>
+      </w:r>
+      <w:r>
+        <w:rPr>
+          <w:lang w:val="en_US" w:bidi="en_US"/>
+        </w:rPr>
+        <w:t>Levites</w:t>
+      </w:r>
+      <w:r>
+        <w:rPr>
+          <w:lang w:val="en_US" w:bidi="en_US"/>
+        </w:rPr>
+        <w:t xml:space="preserve"> could carry the ark without touching it. The craftsmen made a lid for the ark of the covenant from pure gold. The Israelites sometimes called the lid "the mercy seat" or "the atonement cover." The craftsmen also made two golden cherubim and placed these on top of the mercy seat. </w:t>
+      </w:r>
+      <w:r>
+        <w:rPr>
+          <w:lang w:val="en_US" w:bidi="en_US"/>
+        </w:rPr>
+        <w:t>Cherubim</w:t>
+      </w:r>
+      <w:r>
+        <w:rPr>
+          <w:lang w:val="en_US" w:bidi="en_US"/>
+        </w:rPr>
+        <w:t xml:space="preserve"> are spiritual beings who do the will of </w:t>
+      </w:r>
+      <w:r>
+        <w:rPr>
+          <w:lang w:val="en_US" w:bidi="en_US"/>
+        </w:rPr>
+        <w:t>Yahweh</w:t>
+      </w:r>
+      <w:r>
+        <w:rPr>
+          <w:lang w:val="en_US" w:bidi="en_US"/>
+        </w:rPr>
+        <w:t>. The cherubim faced each other and spread their wings over the lid. Moses placed the stone tablets of the law inside the ark. The ark may have also held a jar of manna and Aaron's staff.</w:t>
+      </w:r>
+    </w:p>
+    <w:p>
+      <w:pPr/>
+      <w:r>
+        <w:rPr>
+          <w:lang w:val="en_US" w:bidi="en_US"/>
+        </w:rPr>
+      </w:r>
+      <w:r>
+        <w:rPr>
+          <w:lang w:val="en_US" w:bidi="en_US"/>
+        </w:rPr>
+        <w:t xml:space="preserve">The Israelites' skilled craftsmen made the ark of the covenant while the Israelites were wandering in the desert. Once the Israelites made the ark, they kept it in the </w:t>
+      </w:r>
+      <w:r>
+        <w:rPr>
+          <w:lang w:val="en_US" w:bidi="en_US"/>
+        </w:rPr>
+        <w:t>Most Holy Place</w:t>
+      </w:r>
+      <w:r>
+        <w:rPr>
+          <w:lang w:val="en_US" w:bidi="en_US"/>
+        </w:rPr>
+        <w:t xml:space="preserve"> inside the </w:t>
+      </w:r>
+      <w:r>
+        <w:rPr>
+          <w:lang w:val="en_US" w:bidi="en_US"/>
+        </w:rPr>
+        <w:t>tabernacle</w:t>
+      </w:r>
+      <w:r>
+        <w:rPr>
+          <w:lang w:val="en_US" w:bidi="en_US"/>
+        </w:rPr>
+        <w:t xml:space="preserve">. The priests and Levites were the only Israelites who could touch the poles of the ark to move it. After King Solomon built the </w:t>
+      </w:r>
+      <w:r>
+        <w:rPr>
+          <w:lang w:val="en_US" w:bidi="en_US"/>
+        </w:rPr>
+        <w:t>temple</w:t>
+      </w:r>
+      <w:r>
+        <w:rPr>
+          <w:lang w:val="en_US" w:bidi="en_US"/>
+        </w:rPr>
+        <w:t xml:space="preserve"> of Yahweh, the priests moved the ark into the Most Holy Place in the temple. Some Bible scholars believe that someone moved the ark of the covenant before the Babylonians destroyed the first temple of Yahweh, but other scholars believe that the Babylonians destroyed the ark of the covenant.</w:t>
+      </w:r>
+    </w:p>
+    <w:p>
+      <w:pPr/>
+      <w:r>
+        <w:rPr>
+          <w:lang w:val="en_US" w:bidi="en_US"/>
+        </w:rPr>
+      </w:r>
+      <w:r>
+        <w:rPr>
+          <w:lang w:val="en_US" w:bidi="en_US"/>
+        </w:rPr>
+        <w:t xml:space="preserve">The ark of the covenant symbolized four things: Yahweh's covenant with the Israelites, Yahweh's presence with the Israelites, Yahweh's power, and Yahweh's mercy. First, the ark symbolized Yahweh's covenant with the Israelites. A </w:t>
+      </w:r>
+      <w:r>
+        <w:rPr>
+          <w:lang w:val="en_US" w:bidi="en_US"/>
+        </w:rPr>
+        <w:t>covenant</w:t>
+      </w:r>
+      <w:r>
+        <w:rPr>
+          <w:lang w:val="en_US" w:bidi="en_US"/>
+        </w:rPr>
+        <w:t xml:space="preserve"> is a sacred agreement between two parties who promise to help one another and be loyal to one another. The </w:t>
+      </w:r>
+      <w:r>
+        <w:rPr>
+          <w:lang w:val="en_US" w:bidi="en_US"/>
+        </w:rPr>
+        <w:t>law</w:t>
+      </w:r>
+      <w:r>
+        <w:rPr>
+          <w:lang w:val="en_US" w:bidi="en_US"/>
+        </w:rPr>
+        <w:t>, which Moses wrote on stone tablets, showed the Israelites what they needed to do to be loyal to Yahweh. This is why Yahweh told Moses to put the stone tablets of the law into the ark.</w:t>
+      </w:r>
+    </w:p>
+    <w:p>
+      <w:pPr/>
+      <w:r>
+        <w:rPr>
+          <w:lang w:val="en_US" w:bidi="en_US"/>
+        </w:rPr>
+      </w:r>
+      <w:r>
+        <w:rPr>
+          <w:lang w:val="en_US" w:bidi="en_US"/>
+        </w:rPr>
+        <w:t>When Yahweh made the covenant with the Israelites, Yahweh said that the Israelites would be Yahweh's people and he would be their God. Yahweh promised that his presence would always be with the Israelites. So the second thing that the ark of the covenant represented was Yahweh's presence with the Israelites. Yahweh said that he was literally present on the mercy seat of the ark of the covenant. The Israelites sometimes talked about the mercy seat like it was Yahweh's throne. A throne is a large, beautiful chair that a king sits on. The ark of the covenant, especially the mercy seat, is the place where Yahweh's presence was on earth.</w:t>
+      </w:r>
+    </w:p>
+    <w:p>
+      <w:pPr/>
+      <w:r>
+        <w:rPr>
+          <w:lang w:val="en_US" w:bidi="en_US"/>
+        </w:rPr>
+      </w:r>
+      <w:r>
+        <w:rPr>
+          <w:lang w:val="en_US" w:bidi="en_US"/>
+        </w:rPr>
+        <w:t>Yahweh is all-powerful. Wherever Yahweh is, Yahweh's power is with him. So the third thing that the ark of the covenant represented was Yahweh's power. This is why the Israelites often carried the ark into battle with them. Miraculous things happened everywhere the ark went, because the ark represented Yahweh's power.</w:t>
+      </w:r>
+    </w:p>
+    <w:p>
+      <w:pPr/>
+      <w:r>
+        <w:rPr>
+          <w:lang w:val="en_US" w:bidi="en_US"/>
+        </w:rPr>
+      </w:r>
+      <w:r>
+        <w:rPr>
+          <w:lang w:val="en_US" w:bidi="en_US"/>
+        </w:rPr>
+        <w:t xml:space="preserve">Fourth, the ark represented Yahweh's </w:t>
+      </w:r>
+      <w:r>
+        <w:rPr>
+          <w:lang w:val="en_US" w:bidi="en_US"/>
+        </w:rPr>
+        <w:t>mercy</w:t>
+      </w:r>
+      <w:r>
+        <w:rPr>
+          <w:lang w:val="en_US" w:bidi="en_US"/>
+        </w:rPr>
+        <w:t xml:space="preserve">. Yahweh called the lid of the ark "the mercy seat." Every year on the </w:t>
+      </w:r>
+      <w:r>
+        <w:rPr>
+          <w:lang w:val="en_US" w:bidi="en_US"/>
+        </w:rPr>
+        <w:t>Day of Atonement</w:t>
+      </w:r>
+      <w:r>
+        <w:rPr>
+          <w:lang w:val="en_US" w:bidi="en_US"/>
+        </w:rPr>
+        <w:t xml:space="preserve">, the </w:t>
+      </w:r>
+      <w:r>
+        <w:rPr>
+          <w:lang w:val="en_US" w:bidi="en_US"/>
+        </w:rPr>
+        <w:t>high priest</w:t>
+      </w:r>
+      <w:r>
+        <w:rPr>
+          <w:lang w:val="en_US" w:bidi="en_US"/>
+        </w:rPr>
+        <w:t xml:space="preserve"> came into the Most Holy Place and sprinkled the blood of the sacrifice in front of the ark and on the mercy seat. The Israelites received Yahweh's mercy when Yahweh </w:t>
+      </w:r>
+      <w:r>
+        <w:rPr>
+          <w:lang w:val="en_US" w:bidi="en_US"/>
+        </w:rPr>
+        <w:t>forgave</w:t>
+      </w:r>
+      <w:r>
+        <w:rPr>
+          <w:lang w:val="en_US" w:bidi="en_US"/>
+        </w:rPr>
+        <w:t xml:space="preserve"> their </w:t>
+      </w:r>
+      <w:r>
+        <w:rPr>
+          <w:lang w:val="en_US" w:bidi="en_US"/>
+        </w:rPr>
+        <w:t>sins</w:t>
+      </w:r>
+      <w:r>
+        <w:rPr>
+          <w:lang w:val="en_US" w:bidi="en_US"/>
+        </w:rPr>
+        <w:t>.</w:t>
+      </w:r>
+    </w:p>
+    <w:p>
+      <w:pPr/>
+      <w:r>
+        <w:rPr>
+          <w:lang w:val="en_US" w:bidi="en_US"/>
+        </w:rPr>
+      </w:r>
+      <w:r>
+        <w:rPr>
+          <w:lang w:val="en_US" w:bidi="en_US"/>
+        </w:rPr>
+        <w:t>Storytellers in the Bible usually call this golden chest the ark of the covenant, but sometimes they call it the ark of God, the ark of Yahweh, the holy ark, the ark of power, the testimony or the ark of testimony. In this context, the word "testimony" means the law that Moses wrote on the stone tablets. This law "testifies," or shows the truth that Yahweh has a special covenant with the people of Israel. We sometimes call the ark of the covenant the "covenant box."</w:t>
       </w:r>
       <w:r>
         <w:rPr>
@@ -3435,7 +3643,7 @@
         <w:rPr>
           <w:lang w:val="en_US" w:bidi="en_US"/>
         </w:rPr>
-        <w:t>atonement</w:t>
+        <w:t>ark of the covenant</w:t>
       </w:r>
       <w:r>
         <w:rPr>
@@ -3482,7 +3690,7 @@
         <w:rPr>
           <w:lang w:val="en_US" w:bidi="en_US"/>
         </w:rPr>
-        <w:t xml:space="preserve"> (1745606 KB)</w:t>
+        <w:t xml:space="preserve"> (2.7 MB)</w:t>
       </w:r>
       <w:r>
         <w:rPr>
@@ -3511,129 +3719,83 @@
         <w:rPr>
           <w:lang w:val="en_US" w:bidi="en_US"/>
         </w:rPr>
-        <w:t>authority</w:t>
-      </w:r>
-      <w:r>
-        <w:rPr>
-          <w:lang w:val="en_US" w:bidi="en_US"/>
-        </w:rPr>
-      </w:r>
-    </w:p>
-    <w:p>
-      <w:pPr/>
-      <w:r>
-        <w:rPr>
-          <w:lang w:val="en_US" w:bidi="en_US"/>
-        </w:rPr>
-      </w:r>
-      <w:r>
-        <w:rPr>
-          <w:lang w:val="en_US" w:bidi="en_US"/>
-        </w:rPr>
-        <w:t xml:space="preserve">Someone who has </w:t>
+        <w:t>atonement</w:t>
+      </w:r>
+      <w:r>
+        <w:rPr>
+          <w:lang w:val="en_US" w:bidi="en_US"/>
+        </w:rPr>
+      </w:r>
+    </w:p>
+    <w:p>
+      <w:pPr/>
+      <w:r>
+        <w:rPr>
+          <w:lang w:val="en_US" w:bidi="en_US"/>
+        </w:rPr>
       </w:r>
       <w:r>
         <w:rPr>
           <w:b/>
           <w:lang w:val="en_US" w:bidi="en_US"/>
         </w:rPr>
-        <w:t>authority</w:t>
-      </w:r>
-      <w:r>
-        <w:rPr>
-          <w:lang w:val="en_US" w:bidi="en_US"/>
-        </w:rPr>
-        <w:t xml:space="preserve"> has the right and the power to make decisions and judgments. The highest authority belongs to God. God can give authority to other people to make decisions or judgments on his behalf. God will often show that he has given authority to people by also giving them power to do </w:t>
-      </w:r>
-      <w:r>
-        <w:rPr>
-          <w:lang w:val="en_US" w:bidi="en_US"/>
-        </w:rPr>
-        <w:t>miracles</w:t>
-      </w:r>
-      <w:r>
-        <w:rPr>
-          <w:lang w:val="en_US" w:bidi="en_US"/>
-        </w:rPr>
-        <w:t>.</w:t>
-      </w:r>
-    </w:p>
-    <w:p>
-      <w:pPr/>
-      <w:r>
-        <w:rPr>
-          <w:lang w:val="en_US" w:bidi="en_US"/>
-        </w:rPr>
-      </w:r>
-      <w:r>
-        <w:rPr>
-          <w:lang w:val="en_US" w:bidi="en_US"/>
-        </w:rPr>
-        <w:t xml:space="preserve">Jesus has authority because he is the </w:t>
-      </w:r>
-      <w:r>
-        <w:rPr>
-          <w:lang w:val="en_US" w:bidi="en_US"/>
-        </w:rPr>
-        <w:t>king</w:t>
-      </w:r>
-      <w:r>
-        <w:rPr>
-          <w:lang w:val="en_US" w:bidi="en_US"/>
-        </w:rPr>
-        <w:t>, and God sent him.</w:t>
-      </w:r>
-    </w:p>
-    <w:p>
-      <w:pPr/>
-      <w:r>
-        <w:rPr>
-          <w:lang w:val="en_US" w:bidi="en_US"/>
-        </w:rPr>
-      </w:r>
-      <w:r>
-        <w:rPr>
-          <w:lang w:val="en_US" w:bidi="en_US"/>
-        </w:rPr>
-        <w:t xml:space="preserve">The </w:t>
-      </w:r>
-      <w:r>
-        <w:rPr>
-          <w:lang w:val="en_US" w:bidi="en_US"/>
-        </w:rPr>
-        <w:t>apostles</w:t>
-      </w:r>
-      <w:r>
-        <w:rPr>
-          <w:lang w:val="en_US" w:bidi="en_US"/>
-        </w:rPr>
-        <w:t xml:space="preserve"> had authority in the </w:t>
-      </w:r>
-      <w:r>
-        <w:rPr>
-          <w:lang w:val="en_US" w:bidi="en_US"/>
-        </w:rPr>
-        <w:t>church</w:t>
-      </w:r>
-      <w:r>
-        <w:rPr>
-          <w:lang w:val="en_US" w:bidi="en_US"/>
-        </w:rPr>
-        <w:t>, because Jesus gave it to them. Other people needed to accept their decisions.</w:t>
-      </w:r>
-    </w:p>
-    <w:p>
-      <w:pPr/>
-      <w:r>
-        <w:rPr>
-          <w:lang w:val="en_US" w:bidi="en_US"/>
-        </w:rPr>
-      </w:r>
-      <w:r>
-        <w:rPr>
-          <w:lang w:val="en_US" w:bidi="en_US"/>
-        </w:rPr>
-        <w:t>The Bible has authority because God is speaking to the people through the Bible. This means that people have to listen to what God tells them through the Bible.</w:t>
+        <w:t>t258: atone/atonement</w:t>
+      </w:r>
+    </w:p>
+    <w:p>
+      <w:pPr/>
+      <w:r>
+        <w:rPr>
+          <w:lang w:val="en_US" w:bidi="en_US"/>
+        </w:rPr>
+      </w:r>
+      <w:r>
+        <w:rPr>
+          <w:lang w:val="en_US" w:bidi="en_US"/>
+        </w:rPr>
+        <w:t>During the time of the Old Testament, when someone did something bad to somebody else, people believed that three things would happen. First, people believed that the relationship between the two people would be broken. Second, people believed that the bad thing that the person did would make that person and their surroundings spiritually dirty. Third, people believed that God would notice the spiritual dirt and punish the person who did the bad thing.</w:t>
+      </w:r>
+    </w:p>
+    <w:p>
+      <w:pPr/>
+      <w:r>
+        <w:rPr>
+          <w:lang w:val="en_US" w:bidi="en_US"/>
+        </w:rPr>
+      </w:r>
+      <w:r>
+        <w:rPr>
+          <w:lang w:val="en_US" w:bidi="en_US"/>
+        </w:rPr>
+        <w:t>Atonement fixed all three of these problems. Atonement would restore the broken relationship between the two people. Atonement would cleanse the person and their surroundings from the bad thing that made them spiritually dirty. Because the person was cleansed from the bad thing he or she did, God would not punish the person.</w:t>
+      </w:r>
+    </w:p>
+    <w:p>
+      <w:pPr/>
+      <w:r>
+        <w:rPr>
+          <w:lang w:val="en_US" w:bidi="en_US"/>
+        </w:rPr>
+      </w:r>
+      <w:r>
+        <w:rPr>
+          <w:lang w:val="en_US" w:bidi="en_US"/>
+        </w:rPr>
+        <w:t>If people did something bad to another human, they would usually give a gift to the person they had done something bad to in order to atone for what they did. If people did something bad to Yahweh, they would give Yahweh a gift of an animal sacrifice to atone for what they did. Yahweh said that the blood of the animal would cleanse the person who had done the bad thing. Being spiritually clean would restore that person's good relationship with Yahweh, and so Yahweh would not punish the person for the bad thing that he or she did.</w:t>
+      </w:r>
+    </w:p>
+    <w:p>
+      <w:pPr/>
+      <w:r>
+        <w:rPr>
+          <w:lang w:val="en_US" w:bidi="en_US"/>
+        </w:rPr>
+      </w:r>
+      <w:r>
+        <w:rPr>
+          <w:lang w:val="en_US" w:bidi="en_US"/>
+        </w:rPr>
+        <w:t>In the New Testament, Jesus came to atone for all the bad things that everyone has done. Because Jesus never did anything bad, Jesus did not need to atone for anything. But Jesus chose to die so that Jesus' blood could atone for the bad things that everyone else did. Now, if people choose to become Jesus's followers, Jesus's blood atones for all the bad things those people did against Yahweh. That means that Jesus's blood cleanses people from the spiritual dirt that covers them and makes people clean again. Being spiritually clean restores people's good relationship with Yahweh. Because Jesus's followers are now spiritually clean and have a good relationship with Yahweh, Yahweh will not send them to eternal punishment for what they have done.</w:t>
       </w:r>
       <w:r>
         <w:rPr>
@@ -3662,7 +3824,7 @@
         <w:rPr>
           <w:lang w:val="en_US" w:bidi="en_US"/>
         </w:rPr>
-        <w:t>authority</w:t>
+        <w:t>atonement</w:t>
       </w:r>
       <w:r>
         <w:rPr>
@@ -3709,7 +3871,234 @@
         <w:rPr>
           <w:lang w:val="en_US" w:bidi="en_US"/>
         </w:rPr>
-        <w:t xml:space="preserve"> (561261 KB)</w:t>
+        <w:t xml:space="preserve"> (1.7 MB)</w:t>
+      </w:r>
+      <w:r>
+        <w:rPr>
+          <w:lang w:val="en_US" w:bidi="en_US"/>
+        </w:rPr>
+      </w:r>
+      <w:r>
+        <w:rPr>
+          <w:lang w:val="en_US" w:bidi="en_US"/>
+        </w:rPr>
+      </w:r>
+    </w:p>
+    <w:p>
+      <w:pPr/>
+      <w:r>
+        <w:rPr>
+          <w:lang w:val="en_US" w:bidi="en_US"/>
+        </w:rPr>
+      </w:r>
+    </w:p>
+    <w:p>
+      <w:pPr>
+        <w:pStyle w:val="Heading2"/>
+      </w:pPr>
+      <w:r>
+        <w:rPr>
+          <w:lang w:val="en_US" w:bidi="en_US"/>
+        </w:rPr>
+        <w:t>authority</w:t>
+      </w:r>
+      <w:r>
+        <w:rPr>
+          <w:lang w:val="en_US" w:bidi="en_US"/>
+        </w:rPr>
+      </w:r>
+    </w:p>
+    <w:p>
+      <w:pPr/>
+      <w:r>
+        <w:rPr>
+          <w:lang w:val="en_US" w:bidi="en_US"/>
+        </w:rPr>
+      </w:r>
+      <w:r>
+        <w:rPr>
+          <w:lang w:val="en_US" w:bidi="en_US"/>
+        </w:rPr>
+        <w:t xml:space="preserve">Someone who has </w:t>
+      </w:r>
+      <w:r>
+        <w:rPr>
+          <w:b/>
+          <w:lang w:val="en_US" w:bidi="en_US"/>
+        </w:rPr>
+        <w:t>authority</w:t>
+      </w:r>
+      <w:r>
+        <w:rPr>
+          <w:lang w:val="en_US" w:bidi="en_US"/>
+        </w:rPr>
+        <w:t xml:space="preserve"> has the right and the power to make decisions and judgments. The highest authority belongs to God. God can give authority to other people to make decisions or judgments on his behalf. God will often show that he has given authority to people by also giving them power to do </w:t>
+      </w:r>
+      <w:r>
+        <w:rPr>
+          <w:lang w:val="en_US" w:bidi="en_US"/>
+        </w:rPr>
+        <w:t>miracles</w:t>
+      </w:r>
+      <w:r>
+        <w:rPr>
+          <w:lang w:val="en_US" w:bidi="en_US"/>
+        </w:rPr>
+        <w:t>.</w:t>
+      </w:r>
+    </w:p>
+    <w:p>
+      <w:pPr/>
+      <w:r>
+        <w:rPr>
+          <w:lang w:val="en_US" w:bidi="en_US"/>
+        </w:rPr>
+      </w:r>
+      <w:r>
+        <w:rPr>
+          <w:lang w:val="en_US" w:bidi="en_US"/>
+        </w:rPr>
+        <w:t xml:space="preserve">Jesus has authority because he is the </w:t>
+      </w:r>
+      <w:r>
+        <w:rPr>
+          <w:lang w:val="en_US" w:bidi="en_US"/>
+        </w:rPr>
+        <w:t>king</w:t>
+      </w:r>
+      <w:r>
+        <w:rPr>
+          <w:lang w:val="en_US" w:bidi="en_US"/>
+        </w:rPr>
+        <w:t>, and God sent him.</w:t>
+      </w:r>
+    </w:p>
+    <w:p>
+      <w:pPr/>
+      <w:r>
+        <w:rPr>
+          <w:lang w:val="en_US" w:bidi="en_US"/>
+        </w:rPr>
+      </w:r>
+      <w:r>
+        <w:rPr>
+          <w:lang w:val="en_US" w:bidi="en_US"/>
+        </w:rPr>
+        <w:t xml:space="preserve">The </w:t>
+      </w:r>
+      <w:r>
+        <w:rPr>
+          <w:lang w:val="en_US" w:bidi="en_US"/>
+        </w:rPr>
+        <w:t>apostles</w:t>
+      </w:r>
+      <w:r>
+        <w:rPr>
+          <w:lang w:val="en_US" w:bidi="en_US"/>
+        </w:rPr>
+        <w:t xml:space="preserve"> had authority in the </w:t>
+      </w:r>
+      <w:r>
+        <w:rPr>
+          <w:lang w:val="en_US" w:bidi="en_US"/>
+        </w:rPr>
+        <w:t>church</w:t>
+      </w:r>
+      <w:r>
+        <w:rPr>
+          <w:lang w:val="en_US" w:bidi="en_US"/>
+        </w:rPr>
+        <w:t>, because Jesus gave it to them. Other people needed to accept their decisions.</w:t>
+      </w:r>
+    </w:p>
+    <w:p>
+      <w:pPr/>
+      <w:r>
+        <w:rPr>
+          <w:lang w:val="en_US" w:bidi="en_US"/>
+        </w:rPr>
+      </w:r>
+      <w:r>
+        <w:rPr>
+          <w:lang w:val="en_US" w:bidi="en_US"/>
+        </w:rPr>
+        <w:t>The Bible has authority because God is speaking to the people through the Bible. This means that people have to listen to what God tells them through the Bible.</w:t>
+      </w:r>
+      <w:r>
+        <w:rPr>
+          <w:lang w:val="en_US" w:bidi="en_US"/>
+        </w:rPr>
+      </w:r>
+      <w:r>
+        <w:rPr>
+          <w:lang w:val="en_US" w:bidi="en_US"/>
+        </w:rPr>
+      </w:r>
+    </w:p>
+    <w:p>
+      <w:pPr/>
+      <w:r>
+        <w:rPr>
+          <w:lang w:val="en_US" w:bidi="en_US"/>
+        </w:rPr>
+      </w:r>
+    </w:p>
+    <w:p>
+      <w:pPr>
+        <w:pStyle w:val="Heading2"/>
+      </w:pPr>
+      <w:r>
+        <w:rPr>
+          <w:lang w:val="en_US" w:bidi="en_US"/>
+        </w:rPr>
+        <w:t>authority</w:t>
+      </w:r>
+      <w:r>
+        <w:rPr>
+          <w:lang w:val="en_US" w:bidi="en_US"/>
+        </w:rPr>
+      </w:r>
+    </w:p>
+    <w:p>
+      <w:pPr>
+        <w:pStyle w:val="Heading4"/>
+      </w:pPr>
+      <w:r>
+        <w:rPr>
+          <w:lang w:val="en_US" w:bidi="en_US"/>
+        </w:rPr>
+        <w:t>Audio Content</w:t>
+      </w:r>
+      <w:r>
+        <w:rPr>
+          <w:lang w:val="en_US" w:bidi="en_US"/>
+        </w:rPr>
+      </w:r>
+    </w:p>
+    <w:p>
+      <w:pPr/>
+      <w:r>
+        <w:rPr>
+          <w:lang w:val="en_US" w:bidi="en_US"/>
+        </w:rPr>
+      </w:r>
+      <w:hyperlink r:id="rId28">
+        <w:r>
+          <w:rPr>
+            <w:lang w:val="en_US" w:bidi="en_US"/>
+          </w:rPr>
+          <w:rPr>
+            <w:color w:val="0000EE"/>
+            <w:u w:val="single"/>
+          </w:rPr>
+          <w:t>mp3 file</w:t>
+        </w:r>
+      </w:hyperlink>
+      <w:r>
+        <w:rPr>
+          <w:lang w:val="en_US" w:bidi="en_US"/>
+        </w:rPr>
+        <w:t xml:space="preserve"> (548 KB)</w:t>
       </w:r>
       <w:r>
         <w:rPr>

</xml_diff>